<commit_message>
Set warm CCT to 3000K and parameterize CCT xy blend
</commit_message>
<xml_diff>
--- a/wpa_python_port/claude_version_cct_rgb_gain_method/docs/WPA_Algorithm_Spec_For_Algo_and_DIC.docx
+++ b/wpa_python_port/claude_version_cct_rgb_gain_method/docs/WPA_Algorithm_Spec_For_Algo_and_DIC.docx
@@ -318,7 +318,7 @@
     </w:p>
     <w:p>
       <w:r>
-        <w:t>1) WA_SEL=64 对应 D65(6500K)；2) 冷暖端点覆盖 4500K~9300K；3) 运行时复杂度满足 DIC 实时预算；4) 亮度感知尽量稳定。</w:t>
+        <w:t>1) WA_SEL=64 对应 D65(6500K)；2) 冷暖端点覆盖 3000K~9300K；3) 运行时复杂度满足 DIC 实时预算；4) 亮度感知尽量稳定。</w:t>
       </w:r>
     </w:p>
     <w:p>
@@ -349,7 +349,7 @@
     </w:p>
     <w:p>
       <w:r>
-        <w:t>Eq. (1)  wa &lt;= 64:   T(wa) = 6500 - (64-wa)*(6500-4500)/64</w:t>
+        <w:t>Eq. (1)  wa &lt;= 64:   T(wa) = 6500 - (64-wa)*(6500-3000)/64</w:t>
       </w:r>
     </w:p>
     <w:p>
@@ -359,7 +359,7 @@
     </w:p>
     <w:p>
       <w:r>
-        <w:t>锚点：T(0)=4500K, T(64)=6500K, T(127)=9300K。</w:t>
+        <w:t>锚点：T(0)=3000K, T(64)=6500K, T(127)=9300K。</w:t>
       </w:r>
     </w:p>
     <w:p>
@@ -410,7 +410,7 @@
     <w:p>
       <w:pPr/>
       <w:r>
-        <w:t>b) x(T) 在 3900K~4100K 使用 smoothstep 融合低温/高温两段公式，消除 4000K 附近拐点，避免 LUT 局部折线。</w:t>
+        <w:t>b) x(T) 在可配置平滑窗口 [T_split-delta_t, T_split+delta_t]（默认 [3900K,4100K]）内使用 smoothstep 融合低温/高温两段公式，避免分段点附近 LUT 局部折线。</w:t>
       </w:r>
     </w:p>
     <w:p>
@@ -1387,7 +1387,7 @@
     <w:p>
       <w:pPr/>
       <w:r>
-        <w:t>补充必测项：1) wa_sel-&gt;CCT 映射单调；2) cct_to_xy 在 4000K 附近连续；3) cct_gain_lut 全部为有限正数。</w:t>
+        <w:t>补充必测项：1) wa_sel-&gt;CCT 映射单调；2) cct_to_xy 在 T_split（默认 4000K）附近连续；3) cct_gain_lut 全部为有限正数。</w:t>
       </w:r>
     </w:p>
     <w:p>

</xml_diff>